<commit_message>
Izmeni da pise da preusmerava na user page a ne homepage
Cira je morao da promeni zbog SSU
</commit_message>
<xml_diff>
--- a/SSU/SSU 2 - Prijava korisnika.docx
+++ b/SSU/SSU 2 - Prijava korisnika.docx
@@ -2814,7 +2814,7 @@
           <w:szCs w:val="22"/>
           <w:lang w:val="sr-Latn-RS"/>
         </w:rPr>
-        <w:t>se prijave na svoj nalog kreiran regirstrac</w:t>
+        <w:t>se prijave na svoj nalog kreiran registrac</w:t>
       </w:r>
       <w:r>
         <w:rPr>
@@ -3145,7 +3145,29 @@
           <w:sz w:val="22"/>
           <w:szCs w:val="22"/>
         </w:rPr>
-        <w:t>početnu stranicu</w:t>
+        <w:t>stranicu</w:t>
+      </w:r>
+      <w:r>
+        <w:rPr>
+          <w:sz w:val="22"/>
+          <w:szCs w:val="22"/>
+        </w:rPr>
+        <w:t xml:space="preserve"> njegovog</w:t>
+      </w:r>
+      <w:r>
+        <w:rPr>
+          <w:sz w:val="22"/>
+          <w:szCs w:val="22"/>
+        </w:rPr>
+        <w:t xml:space="preserve"> korisni</w:t>
+      </w:r>
+      <w:r>
+        <w:rPr>
+          <w:sz w:val="22"/>
+          <w:szCs w:val="22"/>
+          <w:lang w:val="sr-Latn-RS"/>
+        </w:rPr>
+        <w:t>čkog profila</w:t>
       </w:r>
     </w:p>
     <w:p>

</xml_diff>